<commit_message>
docs: clarify local repository status and report structure
</commit_message>
<xml_diff>
--- a/documentation/Q1_Q2_System_Architecture_and_Version_Control.docx
+++ b/documentation/Q1_Q2_System_Architecture_and_Version_Control.docx
@@ -2931,9 +2931,10 @@
       </w:pPr>
       <w:r>
         <w:rPr>
-          <w:highlight w:val="yellow"/>
-        </w:rPr>
-        <w:t>Repository URL: To be inserted after the GitHub repository is created. Suggested repository name: cybersecurity-awareness-system.</w:t>
+          <w:rFonts w:ascii="Times New Roman" w:hAnsi="Times New Roman"/>
+          <w:sz w:val="24"/>
+        </w:rPr>
+        <w:t>Repository location: Local Git repository in the assignment workspace. No GitHub or GitLab remote URL has been configured.</w:t>
       </w:r>
     </w:p>
     <w:p>

</xml_diff>

<commit_message>
docs: finalize APA formatting and student metadata
</commit_message>
<xml_diff>
--- a/documentation/Q1_Q2_System_Architecture_and_Version_Control.docx
+++ b/documentation/Q1_Q2_System_Architecture_and_Version_Control.docx
@@ -2977,7 +2977,7 @@
         <w:pStyle w:val="Normal"/>
         <w:bidi w:val="0"/>
         <w:spacing w:lineRule="auto" w:line="480" w:before="0" w:after="0"/>
-        <w:ind w:hanging="0" w:start="0" w:end="0"/>
+        <w:ind w:start="0" w:end="0" w:left="720" w:hanging="720"/>
         <w:rPr>
           <w:rFonts w:ascii="Times New Roman" w:hAnsi="Times New Roman"/>
         </w:rPr>
@@ -3002,7 +3002,7 @@
         <w:pStyle w:val="Normal"/>
         <w:bidi w:val="0"/>
         <w:spacing w:lineRule="auto" w:line="480" w:before="0" w:after="0"/>
-        <w:ind w:hanging="0" w:start="0" w:end="0"/>
+        <w:ind w:start="0" w:end="0" w:left="720" w:hanging="720"/>
         <w:rPr>
           <w:rFonts w:ascii="Times New Roman" w:hAnsi="Times New Roman"/>
         </w:rPr>
@@ -3027,7 +3027,7 @@
         <w:pStyle w:val="Normal"/>
         <w:bidi w:val="0"/>
         <w:spacing w:lineRule="auto" w:line="480" w:before="0" w:after="0"/>
-        <w:ind w:hanging="0" w:start="0" w:end="0"/>
+        <w:ind w:start="0" w:end="0" w:left="720" w:hanging="720"/>
         <w:rPr>
           <w:rFonts w:ascii="Times New Roman" w:hAnsi="Times New Roman"/>
         </w:rPr>
@@ -3052,7 +3052,7 @@
         <w:pStyle w:val="Normal"/>
         <w:bidi w:val="0"/>
         <w:spacing w:lineRule="auto" w:line="480" w:before="0" w:after="0"/>
-        <w:ind w:hanging="0" w:start="0" w:end="0"/>
+        <w:ind w:start="0" w:end="0" w:left="720" w:hanging="720"/>
         <w:rPr>
           <w:rFonts w:ascii="Times New Roman" w:hAnsi="Times New Roman"/>
         </w:rPr>
@@ -3077,7 +3077,7 @@
         <w:pStyle w:val="Normal"/>
         <w:bidi w:val="0"/>
         <w:spacing w:lineRule="auto" w:line="480" w:before="0" w:after="0"/>
-        <w:ind w:hanging="0" w:start="0" w:end="0"/>
+        <w:ind w:start="0" w:end="0" w:left="720" w:hanging="720"/>
         <w:rPr>
           <w:rFonts w:ascii="Times New Roman" w:hAnsi="Times New Roman"/>
         </w:rPr>
@@ -3126,6 +3126,7 @@
       </w:r>
     </w:p>
     <w:sectPr>
+      <w:headerReference w:type="default" r:id="rId12"/>
       <w:type w:val="nextPage"/>
       <w:pgSz w:w="12240" w:h="15840"/>
       <w:pgMar w:left="1440" w:right="1440" w:gutter="0" w:header="0" w:top="1440" w:footer="0" w:bottom="1440"/>
@@ -3136,6 +3137,18 @@
     </w:sectPr>
   </w:body>
 </w:document>
+</file>
+
+<file path=word/header1.xml><?xml version="1.0" encoding="utf-8"?>
+<w:hdr xmlns:m="http://schemas.openxmlformats.org/officeDocument/2006/math" xmlns:mc="http://schemas.openxmlformats.org/markup-compatibility/2006" xmlns:mo="http://schemas.microsoft.com/office/mac/office/2008/main" xmlns:mv="urn:schemas-microsoft-com:mac:vml" xmlns:o="urn:schemas-microsoft-com:office:office" xmlns:r="http://schemas.openxmlformats.org/officeDocument/2006/relationships" xmlns:v="urn:schemas-microsoft-com:vml" xmlns:w10="urn:schemas-microsoft-com:office:word" xmlns:w14="http://schemas.microsoft.com/office/word/2010/wordml" xmlns:w="http://schemas.openxmlformats.org/wordprocessingml/2006/main" xmlns:wne="http://schemas.microsoft.com/office/word/2006/wordml" xmlns:wp14="http://schemas.microsoft.com/office/word/2010/wordprocessingDrawing" xmlns:wp="http://schemas.openxmlformats.org/drawingml/2006/wordprocessingDrawing" xmlns:wpc="http://schemas.microsoft.com/office/word/2010/wordprocessingCanvas" xmlns:wpg="http://schemas.microsoft.com/office/word/2010/wordprocessingGroup" xmlns:wpi="http://schemas.microsoft.com/office/word/2010/wordprocessingInk" xmlns:wps="http://schemas.microsoft.com/office/word/2010/wordprocessingShape" mc:Ignorable="w14 wp14">
+  <w:p>
+    <w:pPr>
+      <w:pStyle w:val="Header"/>
+      <w:jc w:val="right"/>
+    </w:pPr>
+    <w:fldSimple w:instr="PAGE"/>
+  </w:p>
+</w:hdr>
 </file>
 
 <file path=word/styles.xml><?xml version="1.0" encoding="utf-8"?>

</xml_diff>

<commit_message>
docs: add published GitHub repository details
</commit_message>
<xml_diff>
--- a/documentation/Q1_Q2_System_Architecture_and_Version_Control.docx
+++ b/documentation/Q1_Q2_System_Architecture_and_Version_Control.docx
@@ -2504,8 +2504,27 @@
         </w:rPr>
       </w:pPr>
       <w:r>
-        <w:rPr/>
-        <w:t>The project will use Git and GitHub as the version-control platform. The repository will organize source code, documentation, diagrams, tests, and configuration files into clearly labeled folders. Git will record the history of development so that changes to code and documentation can be traced to individual commits. This is particularly important for a capstone because the system requirements, architecture, implementation, and technical report will evolve during development. Software configuration management helps ensure that the correct version of code and documentation is identified at each project milestone (Summers, 2020).</w:t>
+        <w:rPr>
+          <w:rFonts w:ascii="Times New Roman" w:hAnsi="Times New Roman"/>
+          <w:sz w:val="24"/>
+        </w:rPr>
+        <w:t xml:space="preserve">The project uses Git and GitHub for version control and traceability. The repository is available at </w:t>
+      </w:r>
+      <w:hyperlink r:id="rId13">
+        <w:r>
+          <w:rPr>
+            <w:color w:val="0563C1"/>
+            <w:u w:val="single"/>
+          </w:rPr>
+          <w:t>https://github.com/Djgituo/cybersecurity-awareness-system</w:t>
+        </w:r>
+      </w:hyperlink>
+      <w:r>
+        <w:rPr>
+          <w:rFonts w:ascii="Times New Roman" w:hAnsi="Times New Roman"/>
+          <w:sz w:val="24"/>
+        </w:rPr>
+        <w:t xml:space="preserve"> and organizes source code, documentation, diagrams, tests, and configuration files into clearly labeled folders. Git records changes to code and documentation in individual commits, helping identify the correct version at each project milestone. Software configuration management supports that control (Summers, 2020).</w:t>
       </w:r>
     </w:p>
     <w:tbl>
@@ -2881,8 +2900,7 @@
         </w:rPr>
       </w:pPr>
       <w:r>
-        <w:rPr/>
-        <w:t>The primary branches will be main and development. The main branch will contain stable versions that are appropriate for formal submission. The development branch will contain active integration work. Feature branches can be created for individual tasks and merged into development after testing. At major milestones, development can be merged into main. This structure separates stable work from ongoing development and makes it easier to identify the version used for evaluation.</w:t>
+        <w:t>The repository has two published branches, main and development. Main is the stable branch for submission-ready milestones, while development is used for integration work. Feature branches can be created for individual tasks and merged into development after review. At major milestones, development can be merged into main. This structure separates stable work from ongoing development and identifies the version used for evaluation.</w:t>
       </w:r>
     </w:p>
     <w:p>
@@ -2934,7 +2952,23 @@
           <w:rFonts w:ascii="Times New Roman" w:hAnsi="Times New Roman"/>
           <w:sz w:val="24"/>
         </w:rPr>
-        <w:t>Repository location: Local Git repository in the assignment workspace. No GitHub or GitLab remote URL has been configured.</w:t>
+        <w:t xml:space="preserve">Repository URL: </w:t>
+      </w:r>
+      <w:hyperlink r:id="rId13">
+        <w:r>
+          <w:rPr>
+            <w:color w:val="0563C1"/>
+            <w:u w:val="single"/>
+          </w:rPr>
+          <w:t>https://github.com/Djgituo/cybersecurity-awareness-system</w:t>
+        </w:r>
+      </w:hyperlink>
+      <w:r>
+        <w:rPr>
+          <w:rFonts w:ascii="Times New Roman" w:hAnsi="Times New Roman"/>
+          <w:sz w:val="24"/>
+        </w:rPr>
+        <w:t>. Both main and development are published.</w:t>
       </w:r>
     </w:p>
     <w:p>

</xml_diff>

<commit_message>
docs: clarify implemented branch structure
</commit_message>
<xml_diff>
--- a/documentation/Q1_Q2_System_Architecture_and_Version_Control.docx
+++ b/documentation/Q1_Q2_System_Architecture_and_Version_Control.docx
@@ -2983,9 +2983,10 @@
       </w:pPr>
       <w:r>
         <w:rPr>
-          <w:highlight w:val="yellow"/>
-        </w:rPr>
-        <w:t>Suggested branch structure: main → stable submission; development → active integration; feature/* → individual module development.</w:t>
+          <w:rFonts w:ascii="Times New Roman" w:hAnsi="Times New Roman"/>
+          <w:sz w:val="24"/>
+        </w:rPr>
+        <w:t>Branching approach: main holds stable, submission-ready milestones; development is the active integration branch. Both are published on GitHub. Feature branches are planned for module-level work and will merge into development before milestone updates are merged into main.</w:t>
       </w:r>
     </w:p>
     <w:p>

</xml_diff>